<commit_message>
Tests: post-rebase expectation repairs
Attached spaced labels no longer surface as orphan spans, and the
typst writer (changed on main) closes a multi-paragraph block with
a blank line before the bracket. The display math continuation and
marked caption goldens carry the reference docx styles regenerated
on main (7d8ac5387).
</commit_message>
<xml_diff>
--- a/test/docx/golden/display_math_continuation.docx
+++ b/test/docx/golden/display_math_continuation.docx
@@ -172,10 +172,10 @@
   <w:docDefaults>
     <w:rPrDefault>
       <w:rPr>
-        <w:rFonts w:asciiTheme="minorHAnsi" w:cstheme="minorBidi" w:eastAsiaTheme="minorEastAsia" w:hAnsiTheme="minorHAnsi"/>
+        <w:rFonts w:asciiTheme="minorHAnsi" w:eastAsiaTheme="minorEastAsia" w:hAnsiTheme="minorHAnsi" w:cstheme="minorBidi"/>
         <w:sz w:val="24"/>
         <w:szCs w:val="24"/>
-        <w:lang w:bidi="ar-SA" w:eastAsia="zh-CN" w:val="en-US"/>
+        <w:lang w:val="en-US" w:eastAsia="zh-CN" w:bidi="ar-SA"/>
       </w:rPr>
     </w:rPrDefault>
     <w:pPrDefault>
@@ -184,35 +184,35 @@
       </w:pPr>
     </w:pPrDefault>
   </w:docDefaults>
-  <w:latentStyles w:count="276" w:defLockedState="0" w:defQFormat="0" w:defSemiHidden="0" w:defUIPriority="0" w:defUnhideWhenUsed="0"/>
-  <w:style w:default="1" w:styleId="Normal" w:type="paragraph">
+  <w:latentStyles w:defLockedState="0" w:defUIPriority="0" w:defSemiHidden="0" w:defUnhideWhenUsed="0" w:defQFormat="0" w:count="276"/>
+  <w:style w:type="paragraph" w:default="1" w:styleId="Normal">
     <w:name w:val="Normal"/>
     <w:qFormat/>
   </w:style>
-  <w:style w:styleId="BodyText" w:type="paragraph">
+  <w:style w:type="paragraph" w:styleId="BodyText">
     <w:name w:val="Body Text"/>
     <w:basedOn w:val="Normal"/>
     <w:link w:val="BodyTextChar"/>
     <w:qFormat/>
     <w:pPr>
-      <w:spacing w:after="180" w:before="180"/>
-    </w:pPr>
-  </w:style>
-  <w:style w:customStyle="1" w:styleId="FirstParagraph" w:type="paragraph">
+      <w:spacing w:before="180" w:after="180"/>
+    </w:pPr>
+  </w:style>
+  <w:style w:type="paragraph" w:customStyle="1" w:styleId="FirstParagraph">
     <w:name w:val="First Paragraph"/>
     <w:basedOn w:val="BodyText"/>
     <w:next w:val="BodyText"/>
     <w:qFormat/>
   </w:style>
-  <w:style w:customStyle="1" w:styleId="Compact" w:type="paragraph">
+  <w:style w:type="paragraph" w:customStyle="1" w:styleId="Compact">
     <w:name w:val="Compact"/>
     <w:basedOn w:val="BodyText"/>
     <w:qFormat/>
     <w:pPr>
-      <w:spacing w:after="36" w:before="36"/>
-    </w:pPr>
-  </w:style>
-  <w:style w:styleId="Title" w:type="paragraph">
+      <w:spacing w:before="36" w:after="36"/>
+    </w:pPr>
+  </w:style>
+  <w:style w:type="paragraph" w:styleId="Title">
     <w:name w:val="Title"/>
     <w:basedOn w:val="Normal"/>
     <w:next w:val="BodyText"/>
@@ -226,24 +226,24 @@
       <w:jc w:val="center"/>
     </w:pPr>
     <w:rPr>
-      <w:rFonts w:asciiTheme="majorHAnsi" w:cstheme="majorBidi" w:eastAsiaTheme="majorEastAsia" w:hAnsiTheme="majorHAnsi"/>
+      <w:rFonts w:asciiTheme="majorHAnsi" w:eastAsiaTheme="majorEastAsia" w:hAnsiTheme="majorHAnsi" w:cstheme="majorBidi"/>
       <w:sz w:val="56"/>
       <w:szCs w:val="56"/>
     </w:rPr>
   </w:style>
-  <w:style w:customStyle="1" w:styleId="TitleChar" w:type="character">
+  <w:style w:type="character" w:customStyle="1" w:styleId="TitleChar">
     <w:name w:val="Title Char"/>
     <w:basedOn w:val="DefaultParagraphFont"/>
     <w:link w:val="Title"/>
     <w:uiPriority w:val="10"/>
     <w:rsid w:val="00A10FD9"/>
     <w:rPr>
-      <w:rFonts w:asciiTheme="majorHAnsi" w:cstheme="majorBidi" w:eastAsiaTheme="majorEastAsia" w:hAnsiTheme="majorHAnsi"/>
+      <w:rFonts w:asciiTheme="majorHAnsi" w:eastAsiaTheme="majorEastAsia" w:hAnsiTheme="majorHAnsi" w:cstheme="majorBidi"/>
       <w:sz w:val="56"/>
       <w:szCs w:val="56"/>
     </w:rPr>
   </w:style>
-  <w:style w:styleId="Subtitle" w:type="paragraph">
+  <w:style w:type="paragraph" w:styleId="Subtitle">
     <w:name w:val="Subtitle"/>
     <w:basedOn w:val="Title"/>
     <w:next w:val="BodyText"/>
@@ -257,27 +257,27 @@
       </w:numPr>
     </w:pPr>
     <w:rPr>
-      <w:rFonts w:cstheme="majorBidi" w:eastAsiaTheme="majorEastAsia"/>
+      <w:rFonts w:eastAsiaTheme="majorEastAsia" w:cstheme="majorBidi"/>
       <w:spacing w:val="15"/>
       <w:sz w:val="28"/>
       <w:szCs w:val="28"/>
     </w:rPr>
   </w:style>
-  <w:style w:customStyle="1" w:styleId="SubtitleChar" w:type="character">
+  <w:style w:type="character" w:customStyle="1" w:styleId="SubtitleChar">
     <w:name w:val="Subtitle Char"/>
     <w:basedOn w:val="DefaultParagraphFont"/>
     <w:link w:val="Subtitle"/>
     <w:uiPriority w:val="11"/>
     <w:rsid w:val="00A10FD9"/>
     <w:rPr>
-      <w:rFonts w:cstheme="majorBidi" w:eastAsiaTheme="majorEastAsia"/>
-      <w:color w:themeColor="text1" w:themeTint="A6" w:val="595959"/>
+      <w:rFonts w:eastAsiaTheme="majorEastAsia" w:cstheme="majorBidi"/>
+      <w:color w:val="595959" w:themeColor="text1" w:themeTint="A6"/>
       <w:spacing w:val="15"/>
       <w:sz w:val="28"/>
       <w:szCs w:val="28"/>
     </w:rPr>
   </w:style>
-  <w:style w:customStyle="1" w:styleId="Author" w:type="paragraph">
+  <w:style w:type="paragraph" w:customStyle="1" w:styleId="Author">
     <w:name w:val="Author"/>
     <w:basedOn w:val="Title"/>
     <w:next w:val="BodyText"/>
@@ -291,7 +291,7 @@
       <w:szCs w:val="24"/>
     </w:rPr>
   </w:style>
-  <w:style w:styleId="Date" w:type="paragraph">
+  <w:style w:type="paragraph" w:styleId="Date">
     <w:name w:val="Date"/>
     <w:basedOn w:val="Title"/>
     <w:next w:val="BodyText"/>
@@ -305,7 +305,7 @@
       <w:szCs w:val="24"/>
     </w:rPr>
   </w:style>
-  <w:style w:customStyle="1" w:styleId="AbstractTitle" w:type="paragraph">
+  <w:style w:type="paragraph" w:customStyle="1" w:styleId="AbstractTitle">
     <w:name w:val="Abstract Title"/>
     <w:basedOn w:val="Normal"/>
     <w:next w:val="Abstract"/>
@@ -313,7 +313,7 @@
     <w:pPr>
       <w:keepNext/>
       <w:keepLines/>
-      <w:spacing w:after="0" w:before="300"/>
+      <w:spacing w:before="300" w:after="0"/>
       <w:jc w:val="center"/>
     </w:pPr>
     <w:rPr>
@@ -322,7 +322,7 @@
       <w:szCs w:val="20"/>
     </w:rPr>
   </w:style>
-  <w:style w:customStyle="1" w:styleId="Abstract" w:type="paragraph">
+  <w:style w:type="paragraph" w:customStyle="1" w:styleId="Abstract">
     <w:name w:val="Abstract"/>
     <w:basedOn w:val="Normal"/>
     <w:next w:val="BodyText"/>
@@ -330,14 +330,14 @@
     <w:pPr>
       <w:keepNext/>
       <w:keepLines/>
-      <w:spacing w:after="300" w:before="100"/>
+      <w:spacing w:before="100" w:after="300"/>
     </w:pPr>
     <w:rPr>
       <w:sz w:val="20"/>
       <w:szCs w:val="20"/>
     </w:rPr>
   </w:style>
-  <w:style w:styleId="Bibliography" w:type="paragraph">
+  <w:style w:type="paragraph" w:styleId="Bibliography">
     <w:name w:val="Bibliography"/>
     <w:basedOn w:val="Normal"/>
     <w:next w:val="Bibliography"/>
@@ -345,7 +345,7 @@
     <w:pPr/>
     <w:rPr/>
   </w:style>
-  <w:style w:styleId="Heading1" w:type="paragraph">
+  <w:style w:type="paragraph" w:styleId="Heading1">
     <w:name w:val="heading 1"/>
     <w:basedOn w:val="Normal"/>
     <w:next w:val="BodyText"/>
@@ -356,17 +356,17 @@
     <w:pPr>
       <w:keepNext/>
       <w:keepLines/>
-      <w:spacing w:after="80" w:before="360"/>
+      <w:spacing w:before="360" w:after="80"/>
       <w:outlineLvl w:val="0"/>
     </w:pPr>
     <w:rPr>
-      <w:rFonts w:asciiTheme="majorHAnsi" w:cstheme="majorBidi" w:eastAsiaTheme="majorEastAsia" w:hAnsiTheme="majorHAnsi"/>
-      <w:color w:themeColor="accent1" w:themeShade="BF" w:val="0F4761"/>
+      <w:rFonts w:asciiTheme="majorHAnsi" w:eastAsiaTheme="majorEastAsia" w:hAnsiTheme="majorHAnsi" w:cstheme="majorBidi"/>
+      <w:color w:val="0F4761" w:themeColor="accent1" w:themeShade="BF"/>
       <w:sz w:val="40"/>
       <w:szCs w:val="40"/>
     </w:rPr>
   </w:style>
-  <w:style w:styleId="Heading2" w:type="paragraph">
+  <w:style w:type="paragraph" w:styleId="Heading2">
     <w:name w:val="heading 2"/>
     <w:basedOn w:val="Normal"/>
     <w:next w:val="BodyText"/>
@@ -379,17 +379,17 @@
     <w:pPr>
       <w:keepNext/>
       <w:keepLines/>
-      <w:spacing w:after="80" w:before="160"/>
+      <w:spacing w:before="160" w:after="80"/>
       <w:outlineLvl w:val="1"/>
     </w:pPr>
     <w:rPr>
-      <w:rFonts w:asciiTheme="majorHAnsi" w:cstheme="majorBidi" w:eastAsiaTheme="majorEastAsia" w:hAnsiTheme="majorHAnsi"/>
-      <w:color w:themeColor="accent1" w:themeShade="BF" w:val="0F4761"/>
+      <w:rFonts w:asciiTheme="majorHAnsi" w:eastAsiaTheme="majorEastAsia" w:hAnsiTheme="majorHAnsi" w:cstheme="majorBidi"/>
+      <w:color w:val="0F4761" w:themeColor="accent1" w:themeShade="BF"/>
       <w:sz w:val="32"/>
       <w:szCs w:val="32"/>
     </w:rPr>
   </w:style>
-  <w:style w:styleId="Heading3" w:type="paragraph">
+  <w:style w:type="paragraph" w:styleId="Heading3">
     <w:name w:val="heading 3"/>
     <w:basedOn w:val="Normal"/>
     <w:next w:val="BodyText"/>
@@ -402,17 +402,17 @@
     <w:pPr>
       <w:keepNext/>
       <w:keepLines/>
-      <w:spacing w:after="80" w:before="160"/>
+      <w:spacing w:before="160" w:after="80"/>
       <w:outlineLvl w:val="2"/>
     </w:pPr>
     <w:rPr>
-      <w:rFonts w:cstheme="majorBidi" w:eastAsiaTheme="majorEastAsia"/>
-      <w:color w:themeColor="accent1" w:themeShade="BF" w:val="0F4761"/>
+      <w:rFonts w:eastAsiaTheme="majorEastAsia" w:cstheme="majorBidi"/>
+      <w:color w:val="0F4761" w:themeColor="accent1" w:themeShade="BF"/>
       <w:sz w:val="28"/>
       <w:szCs w:val="28"/>
     </w:rPr>
   </w:style>
-  <w:style w:styleId="Heading4" w:type="paragraph">
+  <w:style w:type="paragraph" w:styleId="Heading4">
     <w:name w:val="heading 4"/>
     <w:basedOn w:val="Normal"/>
     <w:next w:val="BodyText"/>
@@ -425,17 +425,17 @@
     <w:pPr>
       <w:keepNext/>
       <w:keepLines/>
-      <w:spacing w:after="40" w:before="80"/>
+      <w:spacing w:before="80" w:after="40"/>
       <w:outlineLvl w:val="3"/>
     </w:pPr>
     <w:rPr>
-      <w:rFonts w:cstheme="majorBidi" w:eastAsiaTheme="majorEastAsia"/>
+      <w:rFonts w:eastAsiaTheme="majorEastAsia" w:cstheme="majorBidi"/>
       <w:i/>
       <w:iCs/>
-      <w:color w:themeColor="accent1" w:themeShade="BF" w:val="0F4761"/>
-    </w:rPr>
-  </w:style>
-  <w:style w:styleId="Heading5" w:type="paragraph">
+      <w:color w:val="0F4761" w:themeColor="accent1" w:themeShade="BF"/>
+    </w:rPr>
+  </w:style>
+  <w:style w:type="paragraph" w:styleId="Heading5">
     <w:name w:val="heading 5"/>
     <w:basedOn w:val="Normal"/>
     <w:next w:val="BodyText"/>
@@ -448,15 +448,15 @@
     <w:pPr>
       <w:keepNext/>
       <w:keepLines/>
-      <w:spacing w:after="40" w:before="80"/>
+      <w:spacing w:before="80" w:after="40"/>
       <w:outlineLvl w:val="4"/>
     </w:pPr>
     <w:rPr>
-      <w:rFonts w:cstheme="majorBidi" w:eastAsiaTheme="majorEastAsia"/>
-      <w:color w:themeColor="accent1" w:themeShade="BF" w:val="0F4761"/>
-    </w:rPr>
-  </w:style>
-  <w:style w:styleId="Heading6" w:type="paragraph">
+      <w:rFonts w:eastAsiaTheme="majorEastAsia" w:cstheme="majorBidi"/>
+      <w:color w:val="0F4761" w:themeColor="accent1" w:themeShade="BF"/>
+    </w:rPr>
+  </w:style>
+  <w:style w:type="paragraph" w:styleId="Heading6">
     <w:name w:val="heading 6"/>
     <w:basedOn w:val="Normal"/>
     <w:next w:val="BodyText"/>
@@ -469,17 +469,17 @@
     <w:pPr>
       <w:keepNext/>
       <w:keepLines/>
-      <w:spacing w:after="0" w:before="40"/>
+      <w:spacing w:before="40" w:after="0"/>
       <w:outlineLvl w:val="5"/>
     </w:pPr>
     <w:rPr>
-      <w:rFonts w:cstheme="majorBidi" w:eastAsiaTheme="majorEastAsia"/>
+      <w:rFonts w:eastAsiaTheme="majorEastAsia" w:cstheme="majorBidi"/>
       <w:i/>
       <w:iCs/>
-      <w:color w:themeColor="text1" w:themeTint="A6" w:val="595959"/>
-    </w:rPr>
-  </w:style>
-  <w:style w:styleId="Heading7" w:type="paragraph">
+      <w:color w:val="595959" w:themeColor="text1" w:themeTint="A6"/>
+    </w:rPr>
+  </w:style>
+  <w:style w:type="paragraph" w:styleId="Heading7">
     <w:name w:val="heading 7"/>
     <w:basedOn w:val="Normal"/>
     <w:next w:val="BodyText"/>
@@ -492,15 +492,15 @@
     <w:pPr>
       <w:keepNext/>
       <w:keepLines/>
-      <w:spacing w:after="0" w:before="40"/>
+      <w:spacing w:before="40" w:after="0"/>
       <w:outlineLvl w:val="6"/>
     </w:pPr>
     <w:rPr>
-      <w:rFonts w:cstheme="majorBidi" w:eastAsiaTheme="majorEastAsia"/>
-      <w:color w:themeColor="text1" w:themeTint="A6" w:val="595959"/>
-    </w:rPr>
-  </w:style>
-  <w:style w:styleId="Heading8" w:type="paragraph">
+      <w:rFonts w:eastAsiaTheme="majorEastAsia" w:cstheme="majorBidi"/>
+      <w:color w:val="595959" w:themeColor="text1" w:themeTint="A6"/>
+    </w:rPr>
+  </w:style>
+  <w:style w:type="paragraph" w:styleId="Heading8">
     <w:name w:val="heading 8"/>
     <w:basedOn w:val="Normal"/>
     <w:next w:val="BodyText"/>
@@ -517,13 +517,13 @@
       <w:outlineLvl w:val="7"/>
     </w:pPr>
     <w:rPr>
-      <w:rFonts w:cstheme="majorBidi" w:eastAsiaTheme="majorEastAsia"/>
+      <w:rFonts w:eastAsiaTheme="majorEastAsia" w:cstheme="majorBidi"/>
       <w:i/>
       <w:iCs/>
-      <w:color w:themeColor="text1" w:themeTint="D8" w:val="272727"/>
-    </w:rPr>
-  </w:style>
-  <w:style w:styleId="Heading9" w:type="paragraph">
+      <w:color w:val="272727" w:themeColor="text1" w:themeTint="D8"/>
+    </w:rPr>
+  </w:style>
+  <w:style w:type="paragraph" w:styleId="Heading9">
     <w:name w:val="heading 9"/>
     <w:basedOn w:val="Normal"/>
     <w:next w:val="BodyText"/>
@@ -540,24 +540,24 @@
       <w:outlineLvl w:val="8"/>
     </w:pPr>
     <w:rPr>
-      <w:rFonts w:cstheme="majorBidi" w:eastAsiaTheme="majorEastAsia"/>
-      <w:color w:themeColor="text1" w:themeTint="D8" w:val="272727"/>
-    </w:rPr>
-  </w:style>
-  <w:style w:customStyle="1" w:styleId="Heading1Char" w:type="character">
+      <w:rFonts w:eastAsiaTheme="majorEastAsia" w:cstheme="majorBidi"/>
+      <w:color w:val="272727" w:themeColor="text1" w:themeTint="D8"/>
+    </w:rPr>
+  </w:style>
+  <w:style w:type="character" w:customStyle="1" w:styleId="Heading1Char">
     <w:name w:val="Heading 1 Char"/>
     <w:basedOn w:val="DefaultParagraphFont"/>
     <w:link w:val="Heading1"/>
     <w:uiPriority w:val="9"/>
     <w:rsid w:val="00A10FD9"/>
     <w:rPr>
-      <w:rFonts w:asciiTheme="majorHAnsi" w:cstheme="majorBidi" w:eastAsiaTheme="majorEastAsia" w:hAnsiTheme="majorHAnsi"/>
-      <w:color w:themeColor="accent1" w:themeShade="BF" w:val="0F4761"/>
+      <w:rFonts w:asciiTheme="majorHAnsi" w:eastAsiaTheme="majorEastAsia" w:hAnsiTheme="majorHAnsi" w:cstheme="majorBidi"/>
+      <w:color w:val="0F4761" w:themeColor="accent1" w:themeShade="BF"/>
       <w:sz w:val="40"/>
       <w:szCs w:val="40"/>
     </w:rPr>
   </w:style>
-  <w:style w:customStyle="1" w:styleId="Heading2Char" w:type="character">
+  <w:style w:type="character" w:customStyle="1" w:styleId="Heading2Char">
     <w:name w:val="Heading 2 Char"/>
     <w:basedOn w:val="DefaultParagraphFont"/>
     <w:link w:val="Heading2"/>
@@ -565,13 +565,13 @@
     <w:semiHidden/>
     <w:rsid w:val="00A10FD9"/>
     <w:rPr>
-      <w:rFonts w:asciiTheme="majorHAnsi" w:cstheme="majorBidi" w:eastAsiaTheme="majorEastAsia" w:hAnsiTheme="majorHAnsi"/>
-      <w:color w:themeColor="accent1" w:themeShade="BF" w:val="0F4761"/>
+      <w:rFonts w:asciiTheme="majorHAnsi" w:eastAsiaTheme="majorEastAsia" w:hAnsiTheme="majorHAnsi" w:cstheme="majorBidi"/>
+      <w:color w:val="0F4761" w:themeColor="accent1" w:themeShade="BF"/>
       <w:sz w:val="32"/>
       <w:szCs w:val="32"/>
     </w:rPr>
   </w:style>
-  <w:style w:customStyle="1" w:styleId="Heading3Char" w:type="character">
+  <w:style w:type="character" w:customStyle="1" w:styleId="Heading3Char">
     <w:name w:val="Heading 3 Char"/>
     <w:basedOn w:val="DefaultParagraphFont"/>
     <w:link w:val="Heading3"/>
@@ -579,13 +579,13 @@
     <w:semiHidden/>
     <w:rsid w:val="00A10FD9"/>
     <w:rPr>
-      <w:rFonts w:cstheme="majorBidi" w:eastAsiaTheme="majorEastAsia"/>
-      <w:color w:themeColor="accent1" w:themeShade="BF" w:val="0F4761"/>
+      <w:rFonts w:eastAsiaTheme="majorEastAsia" w:cstheme="majorBidi"/>
+      <w:color w:val="0F4761" w:themeColor="accent1" w:themeShade="BF"/>
       <w:sz w:val="28"/>
       <w:szCs w:val="28"/>
     </w:rPr>
   </w:style>
-  <w:style w:customStyle="1" w:styleId="Heading4Char" w:type="character">
+  <w:style w:type="character" w:customStyle="1" w:styleId="Heading4Char">
     <w:name w:val="Heading 4 Char"/>
     <w:basedOn w:val="DefaultParagraphFont"/>
     <w:link w:val="Heading4"/>
@@ -593,13 +593,13 @@
     <w:semiHidden/>
     <w:rsid w:val="00A10FD9"/>
     <w:rPr>
-      <w:rFonts w:cstheme="majorBidi" w:eastAsiaTheme="majorEastAsia"/>
+      <w:rFonts w:eastAsiaTheme="majorEastAsia" w:cstheme="majorBidi"/>
       <w:i/>
       <w:iCs/>
-      <w:color w:themeColor="accent1" w:themeShade="BF" w:val="0F4761"/>
-    </w:rPr>
-  </w:style>
-  <w:style w:customStyle="1" w:styleId="Heading5Char" w:type="character">
+      <w:color w:val="0F4761" w:themeColor="accent1" w:themeShade="BF"/>
+    </w:rPr>
+  </w:style>
+  <w:style w:type="character" w:customStyle="1" w:styleId="Heading5Char">
     <w:name w:val="Heading 5 Char"/>
     <w:basedOn w:val="DefaultParagraphFont"/>
     <w:link w:val="Heading5"/>
@@ -607,11 +607,11 @@
     <w:semiHidden/>
     <w:rsid w:val="00A10FD9"/>
     <w:rPr>
-      <w:rFonts w:cstheme="majorBidi" w:eastAsiaTheme="majorEastAsia"/>
-      <w:color w:themeColor="accent1" w:themeShade="BF" w:val="0F4761"/>
-    </w:rPr>
-  </w:style>
-  <w:style w:customStyle="1" w:styleId="Heading6Char" w:type="character">
+      <w:rFonts w:eastAsiaTheme="majorEastAsia" w:cstheme="majorBidi"/>
+      <w:color w:val="0F4761" w:themeColor="accent1" w:themeShade="BF"/>
+    </w:rPr>
+  </w:style>
+  <w:style w:type="character" w:customStyle="1" w:styleId="Heading6Char">
     <w:name w:val="Heading 6 Char"/>
     <w:basedOn w:val="DefaultParagraphFont"/>
     <w:link w:val="Heading6"/>
@@ -619,13 +619,13 @@
     <w:semiHidden/>
     <w:rsid w:val="00A10FD9"/>
     <w:rPr>
-      <w:rFonts w:cstheme="majorBidi" w:eastAsiaTheme="majorEastAsia"/>
+      <w:rFonts w:eastAsiaTheme="majorEastAsia" w:cstheme="majorBidi"/>
       <w:i/>
       <w:iCs/>
-      <w:color w:themeColor="text1" w:themeTint="A6" w:val="595959"/>
-    </w:rPr>
-  </w:style>
-  <w:style w:customStyle="1" w:styleId="Heading7Char" w:type="character">
+      <w:color w:val="595959" w:themeColor="text1" w:themeTint="A6"/>
+    </w:rPr>
+  </w:style>
+  <w:style w:type="character" w:customStyle="1" w:styleId="Heading7Char">
     <w:name w:val="Heading 7 Char"/>
     <w:basedOn w:val="DefaultParagraphFont"/>
     <w:link w:val="Heading7"/>
@@ -633,11 +633,11 @@
     <w:semiHidden/>
     <w:rsid w:val="00A10FD9"/>
     <w:rPr>
-      <w:rFonts w:cstheme="majorBidi" w:eastAsiaTheme="majorEastAsia"/>
-      <w:color w:themeColor="text1" w:themeTint="A6" w:val="595959"/>
-    </w:rPr>
-  </w:style>
-  <w:style w:customStyle="1" w:styleId="Heading8Char" w:type="character">
+      <w:rFonts w:eastAsiaTheme="majorEastAsia" w:cstheme="majorBidi"/>
+      <w:color w:val="595959" w:themeColor="text1" w:themeTint="A6"/>
+    </w:rPr>
+  </w:style>
+  <w:style w:type="character" w:customStyle="1" w:styleId="Heading8Char">
     <w:name w:val="Heading 8 Char"/>
     <w:basedOn w:val="DefaultParagraphFont"/>
     <w:link w:val="Heading8"/>
@@ -645,13 +645,13 @@
     <w:semiHidden/>
     <w:rsid w:val="00A10FD9"/>
     <w:rPr>
-      <w:rFonts w:cstheme="majorBidi" w:eastAsiaTheme="majorEastAsia"/>
+      <w:rFonts w:eastAsiaTheme="majorEastAsia" w:cstheme="majorBidi"/>
       <w:i/>
       <w:iCs/>
-      <w:color w:themeColor="text1" w:themeTint="D8" w:val="272727"/>
-    </w:rPr>
-  </w:style>
-  <w:style w:customStyle="1" w:styleId="Heading9Char" w:type="character">
+      <w:color w:val="272727" w:themeColor="text1" w:themeTint="D8"/>
+    </w:rPr>
+  </w:style>
+  <w:style w:type="character" w:customStyle="1" w:styleId="Heading9Char">
     <w:name w:val="Heading 9 Char"/>
     <w:basedOn w:val="DefaultParagraphFont"/>
     <w:link w:val="Heading9"/>
@@ -659,11 +659,11 @@
     <w:semiHidden/>
     <w:rsid w:val="00A10FD9"/>
     <w:rPr>
-      <w:rFonts w:cstheme="majorBidi" w:eastAsiaTheme="majorEastAsia"/>
-      <w:color w:themeColor="text1" w:themeTint="D8" w:val="272727"/>
-    </w:rPr>
-  </w:style>
-  <w:style w:styleId="BlockText" w:type="paragraph">
+      <w:rFonts w:eastAsiaTheme="majorEastAsia" w:cstheme="majorBidi"/>
+      <w:color w:val="272727" w:themeColor="text1" w:themeTint="D8"/>
+    </w:rPr>
+  </w:style>
+  <w:style w:type="paragraph" w:styleId="BlockText">
     <w:name w:val="Block Text"/>
     <w:basedOn w:val="BodyText"/>
     <w:next w:val="BodyText"/>
@@ -671,11 +671,11 @@
     <w:unhideWhenUsed/>
     <w:qFormat/>
     <w:pPr>
-      <w:spacing w:after="100" w:before="100"/>
+      <w:spacing w:before="100" w:after="100"/>
       <w:ind w:firstLine="0" w:left="480" w:right="480"/>
     </w:pPr>
   </w:style>
-  <w:style w:styleId="FootnoteText" w:type="paragraph">
+  <w:style w:type="paragraph" w:styleId="FootnoteText">
     <w:name w:val="Footnote Text"/>
     <w:basedOn w:val="Normal"/>
     <w:next w:val="FootnoteText"/>
@@ -683,7 +683,7 @@
     <w:unhideWhenUsed/>
     <w:qFormat/>
   </w:style>
-  <w:style w:styleId="FootnoteBlockText" w:type="paragraph">
+  <w:style w:type="paragraph" w:styleId="FootnoteBlockText">
     <w:name w:val="Footnote Block Text"/>
     <w:basedOn w:val="FootnoteText"/>
     <w:next w:val="FootnoteText"/>
@@ -691,28 +691,26 @@
     <w:unhideWhenUsed/>
     <w:qFormat/>
     <w:pPr>
-      <w:spacing w:after="100" w:before="100"/>
+      <w:spacing w:before="100" w:after="100"/>
       <w:ind w:firstLine="0" w:left="480" w:right="480"/>
     </w:pPr>
   </w:style>
-  <w:style w:default="1" w:styleId="DefaultParagraphFont" w:type="character">
+  <w:style w:type="character" w:default="1" w:styleId="DefaultParagraphFont">
     <w:name w:val="Default Paragraph Font"/>
     <w:semiHidden/>
     <w:unhideWhenUsed/>
   </w:style>
-  <w:style w:default="1" w:styleId="Table" w:type="table">
+  <w:style w:type="table" w:default="1" w:styleId="Table">
     <w:name w:val="Table"/>
     <w:basedOn w:val="TableNormal"/>
-    <w:semiHidden/>
-    <w:unhideWhenUsed/>
     <w:qFormat/>
     <w:tblPr>
-      <w:tblInd w:type="dxa" w:w="0"/>
+      <w:tblInd w:w="0" w:type="dxa"/>
       <w:tblCellMar>
-        <w:top w:type="dxa" w:w="0"/>
-        <w:left w:type="dxa" w:w="108"/>
-        <w:bottom w:type="dxa" w:w="0"/>
-        <w:right w:type="dxa" w:w="108"/>
+        <w:top w:w="0" w:type="dxa"/>
+        <w:left w:w="108" w:type="dxa"/>
+        <w:bottom w:w="0" w:type="dxa"/>
+        <w:right w:w="108" w:type="dxa"/>
       </w:tblCellMar>
     </w:tblPr>
     <w:tblStylePr w:type="firstRow">
@@ -724,7 +722,7 @@
       </w:tcPr>
     </w:tblStylePr>
   </w:style>
-  <w:style w:customStyle="1" w:styleId="DefinitionTerm" w:type="paragraph">
+  <w:style w:type="paragraph" w:customStyle="1" w:styleId="DefinitionTerm">
     <w:name w:val="Definition Term"/>
     <w:basedOn w:val="Normal"/>
     <w:next w:val="Definition"/>
@@ -737,49 +735,49 @@
       <w:b/>
     </w:rPr>
   </w:style>
-  <w:style w:customStyle="1" w:styleId="Definition" w:type="paragraph">
+  <w:style w:type="paragraph" w:customStyle="1" w:styleId="Definition">
     <w:name w:val="Definition"/>
     <w:basedOn w:val="Normal"/>
   </w:style>
-  <w:style w:styleId="Caption" w:type="paragraph">
+  <w:style w:type="paragraph" w:styleId="Caption">
     <w:name w:val="Caption"/>
     <w:basedOn w:val="Normal"/>
     <w:link w:val="BodyTextChar"/>
     <w:pPr>
-      <w:spacing w:after="120" w:before="0"/>
+      <w:spacing w:before="0" w:after="120"/>
     </w:pPr>
     <w:rPr>
       <w:i/>
     </w:rPr>
   </w:style>
-  <w:style w:customStyle="1" w:styleId="TableCaption" w:type="paragraph">
+  <w:style w:type="paragraph" w:customStyle="1" w:styleId="TableCaption">
     <w:name w:val="Table Caption"/>
     <w:basedOn w:val="Caption"/>
     <w:pPr>
       <w:keepNext/>
     </w:pPr>
   </w:style>
-  <w:style w:customStyle="1" w:styleId="ImageCaption" w:type="paragraph">
+  <w:style w:type="paragraph" w:customStyle="1" w:styleId="ImageCaption">
     <w:name w:val="Image Caption"/>
     <w:basedOn w:val="Caption"/>
   </w:style>
-  <w:style w:customStyle="1" w:styleId="Figure" w:type="paragraph">
+  <w:style w:type="paragraph" w:customStyle="1" w:styleId="Figure">
     <w:name w:val="Figure"/>
     <w:basedOn w:val="Normal"/>
   </w:style>
-  <w:style w:customStyle="1" w:styleId="CaptionedFigure" w:type="paragraph">
+  <w:style w:type="paragraph" w:customStyle="1" w:styleId="CaptionedFigure">
     <w:name w:val="Captioned Figure"/>
     <w:basedOn w:val="Figure"/>
     <w:pPr>
       <w:keepNext/>
     </w:pPr>
   </w:style>
-  <w:style w:customStyle="1" w:styleId="BodyTextChar" w:type="character">
+  <w:style w:type="character" w:customStyle="1" w:styleId="BodyTextChar">
     <w:name w:val="Body Text Char"/>
     <w:basedOn w:val="DefaultParagraphFont"/>
     <w:link w:val="BodyText"/>
   </w:style>
-  <w:style w:customStyle="1" w:styleId="VerbatimChar" w:type="character">
+  <w:style w:type="character" w:customStyle="1" w:styleId="VerbatimChar">
     <w:name w:val="Verbatim Char"/>
     <w:basedOn w:val="BodyTextChar"/>
     <w:rPr>
@@ -787,25 +785,25 @@
       <w:sz w:val="22"/>
     </w:rPr>
   </w:style>
-  <w:style w:customStyle="1" w:styleId="SectionNumber" w:type="character">
+  <w:style w:type="character" w:customStyle="1" w:styleId="SectionNumber">
     <w:name w:val="Section Number"/>
     <w:basedOn w:val="BodyTextChar"/>
   </w:style>
-  <w:style w:styleId="FootnoteReference" w:type="character">
+  <w:style w:type="character" w:styleId="FootnoteReference">
     <w:name w:val="Footnote Reference"/>
     <w:basedOn w:val="BodyTextChar"/>
     <w:rPr>
       <w:vertAlign w:val="superscript"/>
     </w:rPr>
   </w:style>
-  <w:style w:styleId="Hyperlink" w:type="character">
+  <w:style w:type="character" w:styleId="Hyperlink">
     <w:name w:val="Hyperlink"/>
     <w:basedOn w:val="BodyTextChar"/>
     <w:rPr>
-      <w:color w:themeColor="accent1" w:val="4F81BD"/>
-    </w:rPr>
-  </w:style>
-  <w:style w:styleId="TOCHeading" w:type="paragraph">
+      <w:color w:val="4F81BD" w:themeColor="accent1"/>
+    </w:rPr>
+  </w:style>
+  <w:style w:type="paragraph" w:styleId="TOCHeading">
     <w:name w:val="TOC Heading"/>
     <w:basedOn w:val="Heading1"/>
     <w:next w:val="BodyText"/>
@@ -817,10 +815,10 @@
       <w:outlineLvl w:val="9"/>
     </w:pPr>
     <w:rPr>
-      <w:rFonts w:asciiTheme="majorHAnsi" w:cstheme="majorBidi" w:eastAsiaTheme="majorEastAsia" w:hAnsiTheme="majorHAnsi"/>
+      <w:rFonts w:asciiTheme="majorHAnsi" w:eastAsiaTheme="majorEastAsia" w:hAnsiTheme="majorHAnsi" w:cstheme="majorBidi"/>
       <w:b w:val="0"/>
       <w:bCs w:val="0"/>
-      <w:color w:themeColor="accent1" w:themeShade="BF" w:val="365F91"/>
+      <w:color w:val="365F91" w:themeColor="accent1" w:themeShade="BF"/>
     </w:rPr>
   </w:style>
   <w:style w:type="paragraph" w:customStyle="1" w:styleId="SourceCode">

</xml_diff>

<commit_message>
Docx writer: avoid duplicate indentation in list continuations
Upstream now emits w:ind for subsequent paragraphs in a list item.
A display-math or no-indent continuation added another w:ind with
firstLine=0, producing invalid OOXML. Suppress the lab indentation
when the list continuation already supplies it, and pin the list
cases in the display-math golden.
</commit_message>
<xml_diff>
--- a/test/docx/golden/display_math_continuation.docx
+++ b/test/docx/golden/display_math_continuation.docx
@@ -49,6 +49,48 @@
       </w:pPr>
       <w:r>
         <w:t xml:space="preserve">New paragraph.</w:t>
+      </w:r>
+    </w:p>
+    <w:p>
+      <w:pPr>
+        <w:pStyle w:val="FirstParagraph"/>
+      </w:pPr>
+      <m:oMathPara>
+        <m:oMathParaPr>
+          <m:jc m:val="center"/>
+        </m:oMathParaPr>
+        <m:oMath>
+          <m:r>
+            <m:t>x</m:t>
+          </m:r>
+          <m:r>
+            <m:rPr>
+              <m:sty m:val="p"/>
+            </m:rPr>
+            <m:t>=</m:t>
+          </m:r>
+          <m:r>
+            <m:t>y</m:t>
+          </m:r>
+        </m:oMath>
+      </m:oMathPara>
+    </w:p>
+    <w:p>
+      <w:pPr>
+        <w:pStyle w:val="FirstParagraph"/>
+        <w:ind w:left="720" w:firstLine="0"/>
+      </w:pPr>
+      <w:r>
+        <w:t xml:space="preserve">list continuation.</w:t>
+      </w:r>
+    </w:p>
+    <w:p>
+      <w:pPr>
+        <w:pStyle w:val="FirstParagraph"/>
+        <w:ind w:left="720" w:firstLine="0"/>
+      </w:pPr>
+      <w:r>
+        <w:t xml:space="preserve">no indent in list.</w:t>
       </w:r>
     </w:p>
     <w:sectPr>
@@ -161,8 +203,114 @@
       </w:pPr>
     </w:lvl>
   </w:abstractNum>
+  <w:abstractNum w:abstractNumId="991">
+    <w:nsid w:val="0000A991"/>
+    <w:multiLevelType w:val="multilevel"/>
+    <w:lvl w:ilvl="0">
+      <w:numFmt w:val="bullet"/>
+      <w:lvlText w:val=""/>
+      <w:lvlJc w:val="left"/>
+      <w:pPr>
+        <w:ind w:left="720" w:hanging="360"/>
+      </w:pPr>
+      <w:rPr>
+        <w:rFonts w:ascii="Symbol" w:hAnsi="Symbol" w:cs="Symbol" w:hint="default"/>
+      </w:rPr>
+    </w:lvl>
+    <w:lvl w:ilvl="1">
+      <w:numFmt w:val="bullet"/>
+      <w:lvlText w:val="o"/>
+      <w:lvlJc w:val="left"/>
+      <w:pPr>
+        <w:ind w:left="1440" w:hanging="360"/>
+      </w:pPr>
+      <w:rPr>
+        <w:rFonts w:ascii="Courier New" w:hAnsi="Courier New" w:cs="Courier New" w:hint="default"/>
+      </w:rPr>
+    </w:lvl>
+    <w:lvl w:ilvl="2">
+      <w:numFmt w:val="bullet"/>
+      <w:lvlText w:val=""/>
+      <w:lvlJc w:val="left"/>
+      <w:pPr>
+        <w:ind w:left="2160" w:hanging="360"/>
+      </w:pPr>
+      <w:rPr>
+        <w:rFonts w:ascii="Wingdings" w:hAnsi="Wingdings" w:cs="Wingdings" w:hint="default"/>
+      </w:rPr>
+    </w:lvl>
+    <w:lvl w:ilvl="3">
+      <w:numFmt w:val="bullet"/>
+      <w:lvlText w:val=""/>
+      <w:lvlJc w:val="left"/>
+      <w:pPr>
+        <w:ind w:left="2880" w:hanging="360"/>
+      </w:pPr>
+      <w:rPr>
+        <w:rFonts w:ascii="Symbol" w:hAnsi="Symbol" w:cs="Symbol" w:hint="default"/>
+      </w:rPr>
+    </w:lvl>
+    <w:lvl w:ilvl="4">
+      <w:numFmt w:val="bullet"/>
+      <w:lvlText w:val="o"/>
+      <w:lvlJc w:val="left"/>
+      <w:pPr>
+        <w:ind w:left="3600" w:hanging="360"/>
+      </w:pPr>
+      <w:rPr>
+        <w:rFonts w:ascii="Courier New" w:hAnsi="Courier New" w:cs="Courier New" w:hint="default"/>
+      </w:rPr>
+    </w:lvl>
+    <w:lvl w:ilvl="5">
+      <w:numFmt w:val="bullet"/>
+      <w:lvlText w:val=""/>
+      <w:lvlJc w:val="left"/>
+      <w:pPr>
+        <w:ind w:left="4320" w:hanging="360"/>
+      </w:pPr>
+      <w:rPr>
+        <w:rFonts w:ascii="Wingdings" w:hAnsi="Wingdings" w:cs="Wingdings" w:hint="default"/>
+      </w:rPr>
+    </w:lvl>
+    <w:lvl w:ilvl="6">
+      <w:numFmt w:val="bullet"/>
+      <w:lvlText w:val=""/>
+      <w:lvlJc w:val="left"/>
+      <w:pPr>
+        <w:ind w:left="5040" w:hanging="360"/>
+      </w:pPr>
+      <w:rPr>
+        <w:rFonts w:ascii="Symbol" w:hAnsi="Symbol" w:cs="Symbol" w:hint="default"/>
+      </w:rPr>
+    </w:lvl>
+    <w:lvl w:ilvl="7">
+      <w:numFmt w:val="bullet"/>
+      <w:lvlText w:val="o"/>
+      <w:lvlJc w:val="left"/>
+      <w:pPr>
+        <w:ind w:left="5760" w:hanging="360"/>
+      </w:pPr>
+      <w:rPr>
+        <w:rFonts w:ascii="Courier New" w:hAnsi="Courier New" w:cs="Courier New" w:hint="default"/>
+      </w:rPr>
+    </w:lvl>
+    <w:lvl w:ilvl="8">
+      <w:numFmt w:val="bullet"/>
+      <w:lvlText w:val=""/>
+      <w:lvlJc w:val="left"/>
+      <w:pPr>
+        <w:ind w:left="6480" w:hanging="360"/>
+      </w:pPr>
+      <w:rPr>
+        <w:rFonts w:ascii="Wingdings" w:hAnsi="Wingdings" w:cs="Wingdings" w:hint="default"/>
+      </w:rPr>
+    </w:lvl>
+  </w:abstractNum>
   <w:num w:numId="1000">
     <w:abstractNumId w:val="990"/>
+  </w:num>
+  <w:num w:numId="1001">
+    <w:abstractNumId w:val="991"/>
   </w:num>
 </w:numbering>
 </file>

</xml_diff>